<commit_message>
update docs and build a new version
</commit_message>
<xml_diff>
--- a/document/Readme.docx
+++ b/document/Readme.docx
@@ -95,13 +95,23 @@
         </w:rPr>
         <w:t xml:space="preserve"> در</w:t>
       </w:r>
+      <w:proofErr w:type="spellStart"/>
       <w:r>
         <w:rPr>
           <w:rFonts w:cs="B Zar"/>
           <w:b/>
           <w:bCs/>
         </w:rPr>
-        <w:t>MetaTrader 5</w:t>
+        <w:t>MetaTrader</w:t>
+      </w:r>
+      <w:proofErr w:type="spellEnd"/>
+      <w:r>
+        <w:rPr>
+          <w:rFonts w:cs="B Zar"/>
+          <w:b/>
+          <w:bCs/>
+        </w:rPr>
+        <w:t xml:space="preserve"> 5</w:t>
       </w:r>
       <w:r>
         <w:rPr>
@@ -282,11 +292,19 @@
           <w:rFonts w:cs="B Zar"/>
         </w:rPr>
       </w:pPr>
-      <w:r>
-        <w:rPr>
-          <w:rFonts w:cs="B Zar"/>
-        </w:rPr>
-        <w:t>MetaTrader 5</w:t>
+      <w:proofErr w:type="spellStart"/>
+      <w:r>
+        <w:rPr>
+          <w:rFonts w:cs="B Zar"/>
+        </w:rPr>
+        <w:t>MetaTrader</w:t>
+      </w:r>
+      <w:proofErr w:type="spellEnd"/>
+      <w:r>
+        <w:rPr>
+          <w:rFonts w:cs="B Zar"/>
+        </w:rPr>
+        <w:t xml:space="preserve"> 5</w:t>
       </w:r>
       <w:r>
         <w:rPr>
@@ -370,11 +388,19 @@
         </w:rPr>
         <w:t xml:space="preserve"> نصب </w:t>
       </w:r>
-      <w:r>
-        <w:rPr>
-          <w:rFonts w:cs="B Zar"/>
-        </w:rPr>
-        <w:t>MetaTrader 5</w:t>
+      <w:proofErr w:type="spellStart"/>
+      <w:r>
+        <w:rPr>
+          <w:rFonts w:cs="B Zar"/>
+        </w:rPr>
+        <w:t>MetaTrader</w:t>
+      </w:r>
+      <w:proofErr w:type="spellEnd"/>
+      <w:r>
+        <w:rPr>
+          <w:rFonts w:cs="B Zar"/>
+        </w:rPr>
+        <w:t xml:space="preserve"> 5</w:t>
       </w:r>
       <w:r>
         <w:rPr>
@@ -940,12 +966,14 @@
           <w:rFonts w:cs="B Zar"/>
         </w:rPr>
       </w:pPr>
+      <w:proofErr w:type="spellStart"/>
       <w:r>
         <w:rPr>
           <w:rFonts w:cs="B Zar"/>
         </w:rPr>
         <w:t>TerminalPath</w:t>
       </w:r>
+      <w:proofErr w:type="spellEnd"/>
       <w:r>
         <w:rPr>
           <w:rFonts w:cs="B Zar" w:hint="cs"/>
@@ -980,12 +1008,14 @@
           <w:rtl/>
         </w:rPr>
       </w:pPr>
+      <w:proofErr w:type="spellStart"/>
       <w:r>
         <w:rPr>
           <w:rFonts w:cs="B Zar"/>
         </w:rPr>
         <w:t>DataFolderPath</w:t>
       </w:r>
+      <w:proofErr w:type="spellEnd"/>
       <w:r>
         <w:rPr>
           <w:rFonts w:cs="B Zar" w:hint="cs"/>
@@ -1496,6 +1526,7 @@
           <w:lang w:bidi="fa-IR"/>
         </w:rPr>
       </w:pPr>
+      <w:proofErr w:type="spellStart"/>
       <w:r>
         <w:rPr>
           <w:rFonts w:cs="B Zar"/>
@@ -1503,6 +1534,7 @@
         </w:rPr>
         <w:t>FromDate</w:t>
       </w:r>
+      <w:proofErr w:type="spellEnd"/>
       <w:r>
         <w:rPr>
           <w:rFonts w:cs="B Zar" w:hint="cs"/>
@@ -1555,6 +1587,7 @@
           <w:lang w:bidi="fa-IR"/>
         </w:rPr>
       </w:pPr>
+      <w:proofErr w:type="spellStart"/>
       <w:r>
         <w:rPr>
           <w:rFonts w:cs="B Zar"/>
@@ -1562,6 +1595,7 @@
         </w:rPr>
         <w:t>ToDate</w:t>
       </w:r>
+      <w:proofErr w:type="spellEnd"/>
       <w:r>
         <w:rPr>
           <w:rFonts w:cs="B Zar" w:hint="cs"/>
@@ -1604,15 +1638,15 @@
           <w:rFonts w:cs="B Zar"/>
           <w:lang w:bidi="fa-IR"/>
         </w:rPr>
-        <w:t>Deposit</w:t>
-      </w:r>
-      <w:r>
-        <w:rPr>
-          <w:rFonts w:cs="B Zar" w:hint="cs"/>
-          <w:rtl/>
-          <w:lang w:bidi="fa-IR"/>
-        </w:rPr>
-        <w:t>:  مقدار سرمایه اولیه برای اجرای تست.</w:t>
+        <w:t>Dates</w:t>
+      </w:r>
+      <w:r>
+        <w:rPr>
+          <w:rFonts w:cs="B Zar" w:hint="cs"/>
+          <w:rtl/>
+          <w:lang w:bidi="fa-IR"/>
+        </w:rPr>
+        <w:t>: مقداری برای تعیین استفاده از تمام دیتا ها و یا تاریخ مشخص شده.</w:t>
       </w:r>
     </w:p>
     <w:p>
@@ -1633,15 +1667,15 @@
           <w:rFonts w:cs="B Zar"/>
           <w:lang w:bidi="fa-IR"/>
         </w:rPr>
-        <w:t>Optimization</w:t>
-      </w:r>
-      <w:r>
-        <w:rPr>
-          <w:rFonts w:cs="B Zar" w:hint="cs"/>
-          <w:rtl/>
-          <w:lang w:bidi="fa-IR"/>
-        </w:rPr>
-        <w:t>: تعیین مود بهینه سازی (بین حالت یک تا چهار از اطلاعات داده شده استفاده کنید).</w:t>
+        <w:t>Model</w:t>
+      </w:r>
+      <w:r>
+        <w:rPr>
+          <w:rFonts w:cs="B Zar" w:hint="cs"/>
+          <w:rtl/>
+          <w:lang w:bidi="fa-IR"/>
+        </w:rPr>
+        <w:t>: مقداری برای حالت تست (هر تیک، کندل یک دقیقه و قیمت باز شدن کندل)</w:t>
       </w:r>
     </w:p>
     <w:p>
@@ -1662,8 +1696,68 @@
           <w:rFonts w:cs="B Zar"/>
           <w:lang w:bidi="fa-IR"/>
         </w:rPr>
+        <w:t>Deposit</w:t>
+      </w:r>
+      <w:r>
+        <w:rPr>
+          <w:rFonts w:cs="B Zar" w:hint="cs"/>
+          <w:rtl/>
+          <w:lang w:bidi="fa-IR"/>
+        </w:rPr>
+        <w:t>:  مقدار سرمایه اولیه برای اجرای تست.</w:t>
+      </w:r>
+    </w:p>
+    <w:p>
+      <w:pPr>
+        <w:pStyle w:val="ListParagraph"/>
+        <w:numPr>
+          <w:ilvl w:val="1"/>
+          <w:numId w:val="16"/>
+        </w:numPr>
+        <w:bidi/>
+        <w:rPr>
+          <w:rFonts w:cs="B Zar"/>
+          <w:lang w:bidi="fa-IR"/>
+        </w:rPr>
+      </w:pPr>
+      <w:r>
+        <w:rPr>
+          <w:rFonts w:cs="B Zar"/>
+          <w:lang w:bidi="fa-IR"/>
+        </w:rPr>
+        <w:t>Optimization</w:t>
+      </w:r>
+      <w:r>
+        <w:rPr>
+          <w:rFonts w:cs="B Zar" w:hint="cs"/>
+          <w:rtl/>
+          <w:lang w:bidi="fa-IR"/>
+        </w:rPr>
+        <w:t>: تعیین مود بهینه سازی (بین حالت یک تا چهار از اطلاعات داده شده استفاده کنید).</w:t>
+      </w:r>
+    </w:p>
+    <w:p>
+      <w:pPr>
+        <w:pStyle w:val="ListParagraph"/>
+        <w:numPr>
+          <w:ilvl w:val="1"/>
+          <w:numId w:val="16"/>
+        </w:numPr>
+        <w:bidi/>
+        <w:rPr>
+          <w:rFonts w:cs="B Zar"/>
+          <w:lang w:bidi="fa-IR"/>
+        </w:rPr>
+      </w:pPr>
+      <w:proofErr w:type="spellStart"/>
+      <w:r>
+        <w:rPr>
+          <w:rFonts w:cs="B Zar"/>
+          <w:lang w:bidi="fa-IR"/>
+        </w:rPr>
         <w:t>OptimizationCriterion</w:t>
       </w:r>
+      <w:proofErr w:type="spellEnd"/>
       <w:r>
         <w:rPr>
           <w:rFonts w:cs="B Zar" w:hint="cs"/>
@@ -1688,10 +1782,10 @@
         </w:rPr>
         <w:lastRenderedPageBreak/>
         <w:drawing>
-          <wp:inline distT="0" distB="0" distL="0" distR="0" wp14:anchorId="31B8558A" wp14:editId="7EBA1433">
-            <wp:extent cx="5768105" cy="5512279"/>
-            <wp:effectExtent l="0" t="0" r="4445" b="0"/>
-            <wp:docPr id="1011480458" name="Picture 1"/>
+          <wp:inline distT="0" distB="0" distL="0" distR="0" wp14:anchorId="254EE9A8" wp14:editId="74507616">
+            <wp:extent cx="5714555" cy="7234732"/>
+            <wp:effectExtent l="0" t="0" r="635" b="4445"/>
+            <wp:docPr id="861124193" name="Picture 1"/>
             <wp:cNvGraphicFramePr>
               <a:graphicFrameLocks xmlns:a="http://schemas.openxmlformats.org/drawingml/2006/main" noChangeAspect="1"/>
             </wp:cNvGraphicFramePr>
@@ -1699,7 +1793,7 @@
               <a:graphicData uri="http://schemas.openxmlformats.org/drawingml/2006/picture">
                 <pic:pic xmlns:pic="http://schemas.openxmlformats.org/drawingml/2006/picture">
                   <pic:nvPicPr>
-                    <pic:cNvPr id="1011480458" name=""/>
+                    <pic:cNvPr id="861124193" name=""/>
                     <pic:cNvPicPr/>
                   </pic:nvPicPr>
                   <pic:blipFill>
@@ -1711,7 +1805,7 @@
                   <pic:spPr>
                     <a:xfrm>
                       <a:off x="0" y="0"/>
-                      <a:ext cx="5782080" cy="5525634"/>
+                      <a:ext cx="5729000" cy="7253020"/>
                     </a:xfrm>
                     <a:prstGeom prst="rect">
                       <a:avLst/>
@@ -1752,12 +1846,14 @@
         </w:rPr>
         <w:t>ورودی های اکسپرت (</w:t>
       </w:r>
+      <w:proofErr w:type="spellStart"/>
       <w:r>
         <w:rPr>
           <w:rFonts w:cs="B Zar"/>
         </w:rPr>
         <w:t>TesterInputs</w:t>
       </w:r>
+      <w:proofErr w:type="spellEnd"/>
       <w:r>
         <w:rPr>
           <w:rFonts w:cs="B Zar" w:hint="cs"/>
@@ -1823,6 +1919,7 @@
           <w:noProof/>
           <w:rtl/>
         </w:rPr>
+        <w:lastRenderedPageBreak/>
         <w:drawing>
           <wp:inline distT="0" distB="0" distL="0" distR="0" wp14:anchorId="1F7ADED7" wp14:editId="1EA2C41D">
             <wp:extent cx="3975652" cy="1571487"/>
@@ -2061,7 +2158,6 @@
         <w:rPr>
           <w:rFonts w:cs="B Zar"/>
         </w:rPr>
-        <w:lastRenderedPageBreak/>
         <w:t>configs</w:t>
       </w:r>
       <w:r>
@@ -2510,6 +2606,7 @@
         </w:rPr>
         <w:t>Res</w:t>
       </w:r>
+      <w:proofErr w:type="gramStart"/>
       <w:r>
         <w:rPr>
           <w:rFonts w:cs="B Zar"/>
@@ -2537,6 +2634,7 @@
         </w:rPr>
         <w:t xml:space="preserve"> </w:t>
       </w:r>
+      <w:proofErr w:type="spellStart"/>
       <w:r>
         <w:rPr>
           <w:rFonts w:cs="B Zar"/>
@@ -2544,8 +2642,9 @@
           <w:szCs w:val="24"/>
           <w:lang w:bidi="fa-IR"/>
         </w:rPr>
-        <w:t xml:space="preserve">file_name </w:t>
-      </w:r>
+        <w:t>file</w:t>
+      </w:r>
+      <w:proofErr w:type="gramEnd"/>
       <w:r>
         <w:rPr>
           <w:rFonts w:cs="B Zar"/>
@@ -2553,8 +2652,9 @@
           <w:szCs w:val="24"/>
           <w:lang w:bidi="fa-IR"/>
         </w:rPr>
-        <w:t>}_{</w:t>
-      </w:r>
+        <w:t>_name</w:t>
+      </w:r>
+      <w:proofErr w:type="spellEnd"/>
       <w:r>
         <w:rPr>
           <w:rFonts w:cs="B Zar"/>
@@ -2562,7 +2662,7 @@
           <w:szCs w:val="24"/>
           <w:lang w:bidi="fa-IR"/>
         </w:rPr>
-        <w:t xml:space="preserve"> T</w:t>
+        <w:t xml:space="preserve"> </w:t>
       </w:r>
       <w:r>
         <w:rPr>
@@ -2571,7 +2671,47 @@
           <w:szCs w:val="24"/>
           <w:lang w:bidi="fa-IR"/>
         </w:rPr>
-        <w:t>imestamp</w:t>
+        <w:t>}</w:t>
+      </w:r>
+      <w:r>
+        <w:rPr>
+          <w:rFonts w:cs="B Zar"/>
+        </w:rPr>
+        <w:t>_</w:t>
+      </w:r>
+      <w:proofErr w:type="spellStart"/>
+      <w:r>
+        <w:rPr>
+          <w:rFonts w:cs="B Zar"/>
+        </w:rPr>
+        <w:t>TimeOptimize</w:t>
+      </w:r>
+      <w:proofErr w:type="spellEnd"/>
+      <w:r>
+        <w:rPr>
+          <w:rFonts w:cs="B Zar"/>
+        </w:rPr>
+        <w:t>_</w:t>
+      </w:r>
+      <w:r>
+        <w:rPr>
+          <w:rFonts w:cs="B Zar"/>
+        </w:rPr>
+        <w:t xml:space="preserve">{ Test or Train }_{ symbol }_{ </w:t>
+      </w:r>
+      <w:proofErr w:type="spellStart"/>
+      <w:r>
+        <w:rPr>
+          <w:rFonts w:cs="B Zar"/>
+        </w:rPr>
+        <w:t>TimeFrame</w:t>
+      </w:r>
+      <w:proofErr w:type="spellEnd"/>
+      <w:r>
+        <w:rPr>
+          <w:rFonts w:cs="B Zar"/>
+        </w:rPr>
+        <w:t xml:space="preserve"> }_</w:t>
       </w:r>
       <w:r>
         <w:rPr>
@@ -2580,7 +2720,7 @@
           <w:szCs w:val="24"/>
           <w:lang w:bidi="fa-IR"/>
         </w:rPr>
-        <w:t xml:space="preserve"> </w:t>
+        <w:t>{</w:t>
       </w:r>
       <w:r>
         <w:rPr>
@@ -2589,7 +2729,7 @@
           <w:szCs w:val="24"/>
           <w:lang w:bidi="fa-IR"/>
         </w:rPr>
-        <w:t>}</w:t>
+        <w:t xml:space="preserve"> T</w:t>
       </w:r>
       <w:r>
         <w:rPr>
@@ -2598,21 +2738,8 @@
           <w:szCs w:val="24"/>
           <w:lang w:bidi="fa-IR"/>
         </w:rPr>
-        <w:t>.</w:t>
-      </w:r>
-      <w:r>
-        <w:rPr>
-          <w:rFonts w:cs="B Zar"/>
-        </w:rPr>
-        <w:t>csv</w:t>
-      </w:r>
-    </w:p>
-    <w:p>
-      <w:pPr>
-        <w:rPr>
-          <w:rFonts w:cs="B Zar"/>
-        </w:rPr>
-      </w:pPr>
+        <w:t>imestamp</w:t>
+      </w:r>
       <w:r>
         <w:rPr>
           <w:rFonts w:cs="B Zar"/>
@@ -2620,7 +2747,7 @@
           <w:szCs w:val="24"/>
           <w:lang w:bidi="fa-IR"/>
         </w:rPr>
-        <w:t>Res</w:t>
+        <w:t xml:space="preserve"> </w:t>
       </w:r>
       <w:r>
         <w:rPr>
@@ -2629,7 +2756,7 @@
           <w:szCs w:val="24"/>
           <w:lang w:bidi="fa-IR"/>
         </w:rPr>
-        <w:t>_</w:t>
+        <w:t>}</w:t>
       </w:r>
       <w:r>
         <w:rPr>
@@ -2638,7 +2765,7 @@
           <w:szCs w:val="24"/>
           <w:lang w:bidi="fa-IR"/>
         </w:rPr>
-        <w:t>{</w:t>
+        <w:t>.</w:t>
       </w:r>
       <w:r>
         <w:rPr>
@@ -2647,291 +2774,8 @@
           <w:szCs w:val="24"/>
           <w:lang w:bidi="fa-IR"/>
         </w:rPr>
-        <w:t xml:space="preserve"> file_name </w:t>
-      </w:r>
-      <w:r>
-        <w:rPr>
-          <w:rFonts w:cs="B Zar"/>
-          <w:sz w:val="24"/>
-          <w:szCs w:val="24"/>
-          <w:lang w:bidi="fa-IR"/>
-        </w:rPr>
-        <w:t>}_{</w:t>
-      </w:r>
-      <w:r>
-        <w:rPr>
-          <w:rFonts w:cs="B Zar"/>
-          <w:sz w:val="24"/>
-          <w:szCs w:val="24"/>
-          <w:lang w:bidi="fa-IR"/>
-        </w:rPr>
-        <w:t xml:space="preserve"> T</w:t>
-      </w:r>
-      <w:r>
-        <w:rPr>
-          <w:rFonts w:cs="B Zar"/>
-          <w:sz w:val="24"/>
-          <w:szCs w:val="24"/>
-          <w:lang w:bidi="fa-IR"/>
-        </w:rPr>
-        <w:t>imestamp</w:t>
-      </w:r>
-      <w:r>
-        <w:rPr>
-          <w:rFonts w:cs="B Zar"/>
-          <w:sz w:val="24"/>
-          <w:szCs w:val="24"/>
-          <w:lang w:bidi="fa-IR"/>
-        </w:rPr>
-        <w:t xml:space="preserve"> </w:t>
-      </w:r>
-      <w:r>
-        <w:rPr>
-          <w:rFonts w:cs="B Zar"/>
-          <w:sz w:val="24"/>
-          <w:szCs w:val="24"/>
-          <w:lang w:bidi="fa-IR"/>
-        </w:rPr>
-        <w:t>}</w:t>
-      </w:r>
-      <w:r>
-        <w:rPr>
-          <w:rFonts w:cs="B Zar"/>
-          <w:sz w:val="24"/>
-          <w:szCs w:val="24"/>
-          <w:lang w:bidi="fa-IR"/>
-        </w:rPr>
-        <w:t>.</w:t>
-      </w:r>
-      <w:r>
-        <w:rPr>
-          <w:rFonts w:cs="B Zar"/>
-        </w:rPr>
-        <w:t>ini</w:t>
-      </w:r>
-    </w:p>
-    <w:p>
-      <w:pPr>
-        <w:rPr>
-          <w:rFonts w:cs="B Zar"/>
-          <w:lang w:bidi="fa-IR"/>
-        </w:rPr>
-      </w:pPr>
-      <w:r>
-        <w:rPr>
-          <w:rFonts w:cs="B Zar"/>
-          <w:sz w:val="24"/>
-          <w:szCs w:val="24"/>
-          <w:lang w:bidi="fa-IR"/>
-        </w:rPr>
-        <w:t>Res</w:t>
-      </w:r>
-      <w:r>
-        <w:rPr>
-          <w:rFonts w:cs="B Zar"/>
-          <w:sz w:val="24"/>
-          <w:szCs w:val="24"/>
-          <w:lang w:bidi="fa-IR"/>
-        </w:rPr>
-        <w:t>_</w:t>
-      </w:r>
-      <w:r>
-        <w:rPr>
-          <w:rFonts w:cs="B Zar"/>
-          <w:sz w:val="24"/>
-          <w:szCs w:val="24"/>
-          <w:lang w:bidi="fa-IR"/>
-        </w:rPr>
-        <w:t>{</w:t>
-      </w:r>
-      <w:r>
-        <w:rPr>
-          <w:rFonts w:cs="B Zar"/>
-          <w:sz w:val="24"/>
-          <w:szCs w:val="24"/>
-          <w:lang w:bidi="fa-IR"/>
-        </w:rPr>
-        <w:t xml:space="preserve"> file_name </w:t>
-      </w:r>
-      <w:r>
-        <w:rPr>
-          <w:rFonts w:cs="B Zar"/>
-          <w:sz w:val="24"/>
-          <w:szCs w:val="24"/>
-          <w:lang w:bidi="fa-IR"/>
-        </w:rPr>
-        <w:t>}_{</w:t>
-      </w:r>
-      <w:r>
-        <w:rPr>
-          <w:rFonts w:cs="B Zar"/>
-          <w:sz w:val="24"/>
-          <w:szCs w:val="24"/>
-          <w:lang w:bidi="fa-IR"/>
-        </w:rPr>
-        <w:t xml:space="preserve"> T</w:t>
-      </w:r>
-      <w:r>
-        <w:rPr>
-          <w:rFonts w:cs="B Zar"/>
-          <w:sz w:val="24"/>
-          <w:szCs w:val="24"/>
-          <w:lang w:bidi="fa-IR"/>
-        </w:rPr>
-        <w:t>imestamp</w:t>
-      </w:r>
-      <w:r>
-        <w:rPr>
-          <w:rFonts w:cs="B Zar"/>
-          <w:sz w:val="24"/>
-          <w:szCs w:val="24"/>
-          <w:lang w:bidi="fa-IR"/>
-        </w:rPr>
-        <w:t xml:space="preserve"> </w:t>
-      </w:r>
-      <w:r>
-        <w:rPr>
-          <w:rFonts w:cs="B Zar"/>
-          <w:sz w:val="24"/>
-          <w:szCs w:val="24"/>
-          <w:lang w:bidi="fa-IR"/>
-        </w:rPr>
-        <w:t>}</w:t>
-      </w:r>
-      <w:r>
-        <w:rPr>
-          <w:rFonts w:cs="B Zar"/>
-          <w:sz w:val="24"/>
-          <w:szCs w:val="24"/>
-          <w:lang w:bidi="fa-IR"/>
-        </w:rPr>
-        <w:t>.</w:t>
-      </w:r>
-      <w:r>
-        <w:rPr>
-          <w:rFonts w:cs="B Zar"/>
-        </w:rPr>
-        <w:t>set</w:t>
-      </w:r>
-    </w:p>
-    <w:p>
-      <w:pPr>
-        <w:rPr>
-          <w:rFonts w:cs="B Zar"/>
-          <w:lang w:bidi="fa-IR"/>
-        </w:rPr>
-      </w:pPr>
-      <w:r>
-        <w:rPr>
-          <w:rFonts w:cs="B Zar"/>
-          <w:sz w:val="24"/>
-          <w:szCs w:val="24"/>
-          <w:lang w:bidi="fa-IR"/>
-        </w:rPr>
-        <w:t>Res</w:t>
-      </w:r>
-      <w:r>
-        <w:rPr>
-          <w:rFonts w:cs="B Zar"/>
-          <w:sz w:val="24"/>
-          <w:szCs w:val="24"/>
-          <w:lang w:bidi="fa-IR"/>
-        </w:rPr>
-        <w:t>_</w:t>
-      </w:r>
-      <w:r>
-        <w:rPr>
-          <w:rFonts w:cs="B Zar"/>
-          <w:sz w:val="24"/>
-          <w:szCs w:val="24"/>
-          <w:lang w:bidi="fa-IR"/>
-        </w:rPr>
-        <w:t>{</w:t>
-      </w:r>
-      <w:r>
-        <w:rPr>
-          <w:rFonts w:cs="B Zar"/>
-          <w:sz w:val="24"/>
-          <w:szCs w:val="24"/>
-          <w:lang w:bidi="fa-IR"/>
-        </w:rPr>
-        <w:t xml:space="preserve"> file_name </w:t>
-      </w:r>
-      <w:r>
-        <w:rPr>
-          <w:rFonts w:cs="B Zar"/>
-          <w:sz w:val="24"/>
-          <w:szCs w:val="24"/>
-          <w:lang w:bidi="fa-IR"/>
-        </w:rPr>
-        <w:t>}_{</w:t>
-      </w:r>
-      <w:r>
-        <w:rPr>
-          <w:rFonts w:cs="B Zar"/>
-          <w:sz w:val="24"/>
-          <w:szCs w:val="24"/>
-          <w:lang w:bidi="fa-IR"/>
-        </w:rPr>
-        <w:t xml:space="preserve"> T</w:t>
-      </w:r>
-      <w:r>
-        <w:rPr>
-          <w:rFonts w:cs="B Zar"/>
-          <w:sz w:val="24"/>
-          <w:szCs w:val="24"/>
-          <w:lang w:bidi="fa-IR"/>
-        </w:rPr>
-        <w:t>imestamp</w:t>
-      </w:r>
-      <w:r>
-        <w:rPr>
-          <w:rFonts w:cs="B Zar"/>
-          <w:sz w:val="24"/>
-          <w:szCs w:val="24"/>
-          <w:lang w:bidi="fa-IR"/>
-        </w:rPr>
-        <w:t xml:space="preserve"> </w:t>
-      </w:r>
-      <w:r>
-        <w:rPr>
-          <w:rFonts w:cs="B Zar"/>
-          <w:sz w:val="24"/>
-          <w:szCs w:val="24"/>
-          <w:lang w:bidi="fa-IR"/>
-        </w:rPr>
-        <w:t>}</w:t>
-      </w:r>
-      <w:r>
-        <w:rPr>
-          <w:rFonts w:cs="B Zar"/>
-          <w:sz w:val="24"/>
-          <w:szCs w:val="24"/>
-          <w:lang w:bidi="fa-IR"/>
-        </w:rPr>
-        <w:t>.</w:t>
-      </w:r>
-      <w:r>
-        <w:rPr>
-          <w:rFonts w:cs="B Zar"/>
-        </w:rPr>
-        <w:t>xml</w:t>
-      </w:r>
-    </w:p>
-    <w:p>
-      <w:pPr>
-        <w:rPr>
-          <w:rFonts w:cs="B Zar"/>
-        </w:rPr>
-      </w:pPr>
-    </w:p>
-    <w:p>
-      <w:pPr>
-        <w:bidi/>
-        <w:rPr>
-          <w:rFonts w:cs="B Zar"/>
-        </w:rPr>
-      </w:pPr>
+        <w:t>format</w:t>
+      </w:r>
     </w:p>
     <w:p>
       <w:pPr>
@@ -3143,6 +2987,15 @@
     <w:p>
       <w:pPr>
         <w:bidi/>
+        <w:rPr>
+          <w:rFonts w:cs="B Zar"/>
+        </w:rPr>
+      </w:pPr>
+    </w:p>
+    <w:p>
+      <w:pPr>
+        <w:bidi/>
+        <w:jc w:val="right"/>
         <w:rPr>
           <w:rFonts w:cs="B Zar"/>
         </w:rPr>
@@ -3197,6 +3050,7 @@
                 <w:szCs w:val="24"/>
                 <w:lang w:bidi="fa-IR"/>
               </w:rPr>
+              <w:lastRenderedPageBreak/>
               <w:t>Developer</w:t>
             </w:r>
           </w:p>
@@ -3312,6 +3166,7 @@
           <w:rFonts w:cs="B Zar"/>
           <w:sz w:val="24"/>
           <w:szCs w:val="24"/>
+          <w:rtl/>
           <w:lang w:bidi="fa-IR"/>
         </w:rPr>
       </w:pPr>
@@ -3324,10 +3179,305 @@
           <w:rFonts w:cs="B Zar"/>
           <w:sz w:val="24"/>
           <w:szCs w:val="24"/>
-          <w:rtl/>
-          <w:lang w:bidi="fa-IR"/>
-        </w:rPr>
-      </w:pPr>
+          <w:lang w:bidi="fa-IR"/>
+        </w:rPr>
+      </w:pPr>
+    </w:p>
+    <w:p>
+      <w:pPr>
+        <w:pStyle w:val="ListParagraph"/>
+        <w:numPr>
+          <w:ilvl w:val="0"/>
+          <w:numId w:val="1"/>
+        </w:numPr>
+        <w:bidi/>
+        <w:jc w:val="both"/>
+        <w:rPr>
+          <w:rFonts w:cs="B Zar"/>
+          <w:sz w:val="24"/>
+          <w:szCs w:val="24"/>
+          <w:lang w:bidi="fa-IR"/>
+        </w:rPr>
+      </w:pPr>
+      <w:r>
+        <w:rPr>
+          <w:rFonts w:cs="B Zar" w:hint="cs"/>
+          <w:sz w:val="24"/>
+          <w:szCs w:val="24"/>
+          <w:rtl/>
+          <w:lang w:bidi="fa-IR"/>
+        </w:rPr>
+        <w:t>تغییرات نسخه ها:</w:t>
+      </w:r>
+    </w:p>
+    <w:p>
+      <w:pPr>
+        <w:pStyle w:val="ListParagraph"/>
+        <w:numPr>
+          <w:ilvl w:val="1"/>
+          <w:numId w:val="1"/>
+        </w:numPr>
+        <w:bidi/>
+        <w:jc w:val="both"/>
+        <w:rPr>
+          <w:rFonts w:cs="B Zar"/>
+          <w:sz w:val="24"/>
+          <w:szCs w:val="24"/>
+          <w:lang w:bidi="fa-IR"/>
+        </w:rPr>
+      </w:pPr>
+      <w:r>
+        <w:rPr>
+          <w:rFonts w:cs="B Zar" w:hint="cs"/>
+          <w:sz w:val="24"/>
+          <w:szCs w:val="24"/>
+          <w:rtl/>
+          <w:lang w:bidi="fa-IR"/>
+        </w:rPr>
+        <w:t>1.0.1:</w:t>
+      </w:r>
+    </w:p>
+    <w:p>
+      <w:pPr>
+        <w:pStyle w:val="ListParagraph"/>
+        <w:numPr>
+          <w:ilvl w:val="2"/>
+          <w:numId w:val="1"/>
+        </w:numPr>
+        <w:bidi/>
+        <w:jc w:val="both"/>
+        <w:rPr>
+          <w:rFonts w:cs="B Zar"/>
+          <w:sz w:val="24"/>
+          <w:szCs w:val="24"/>
+          <w:lang w:bidi="fa-IR"/>
+        </w:rPr>
+      </w:pPr>
+      <w:r>
+        <w:rPr>
+          <w:rFonts w:cs="B Zar" w:hint="cs"/>
+          <w:sz w:val="24"/>
+          <w:szCs w:val="24"/>
+          <w:rtl/>
+          <w:lang w:bidi="fa-IR"/>
+        </w:rPr>
+        <w:t xml:space="preserve">اجرای برنامه در دو حالت تست و آموزش برای </w:t>
+      </w:r>
+      <w:r>
+        <w:rPr>
+          <w:rFonts w:cs="B Zar" w:hint="cs"/>
+          <w:sz w:val="24"/>
+          <w:szCs w:val="24"/>
+          <w:rtl/>
+          <w:lang w:bidi="fa-IR"/>
+        </w:rPr>
+        <w:t>به ازای هر</w:t>
+      </w:r>
+      <w:r>
+        <w:rPr>
+          <w:rFonts w:cs="B Zar" w:hint="cs"/>
+          <w:sz w:val="24"/>
+          <w:szCs w:val="24"/>
+          <w:rtl/>
+          <w:lang w:bidi="fa-IR"/>
+        </w:rPr>
+        <w:t xml:space="preserve"> فایل</w:t>
+      </w:r>
+      <w:r>
+        <w:rPr>
+          <w:rFonts w:cs="B Zar" w:hint="cs"/>
+          <w:sz w:val="24"/>
+          <w:szCs w:val="24"/>
+          <w:rtl/>
+          <w:lang w:bidi="fa-IR"/>
+        </w:rPr>
+        <w:t xml:space="preserve"> ورودی</w:t>
+      </w:r>
+      <w:r>
+        <w:rPr>
+          <w:rFonts w:cs="B Zar" w:hint="cs"/>
+          <w:sz w:val="24"/>
+          <w:szCs w:val="24"/>
+          <w:rtl/>
+          <w:lang w:bidi="fa-IR"/>
+        </w:rPr>
+        <w:t>.</w:t>
+      </w:r>
+    </w:p>
+    <w:p>
+      <w:pPr>
+        <w:pStyle w:val="ListParagraph"/>
+        <w:numPr>
+          <w:ilvl w:val="2"/>
+          <w:numId w:val="1"/>
+        </w:numPr>
+        <w:bidi/>
+        <w:jc w:val="both"/>
+        <w:rPr>
+          <w:rFonts w:cs="B Zar"/>
+          <w:sz w:val="24"/>
+          <w:szCs w:val="24"/>
+          <w:lang w:bidi="fa-IR"/>
+        </w:rPr>
+      </w:pPr>
+      <w:r>
+        <w:rPr>
+          <w:rFonts w:cs="B Zar" w:hint="cs"/>
+          <w:sz w:val="24"/>
+          <w:szCs w:val="24"/>
+          <w:rtl/>
+          <w:lang w:bidi="fa-IR"/>
+        </w:rPr>
+        <w:t xml:space="preserve">تغییر متغیر های فایل </w:t>
+      </w:r>
+      <w:r>
+        <w:rPr>
+          <w:rFonts w:cs="B Zar"/>
+          <w:sz w:val="24"/>
+          <w:szCs w:val="24"/>
+          <w:lang w:bidi="fa-IR"/>
+        </w:rPr>
+        <w:t>settings.ini</w:t>
+      </w:r>
+      <w:r>
+        <w:rPr>
+          <w:rFonts w:cs="B Zar" w:hint="cs"/>
+          <w:sz w:val="24"/>
+          <w:szCs w:val="24"/>
+          <w:rtl/>
+          <w:lang w:bidi="fa-IR"/>
+        </w:rPr>
+        <w:t xml:space="preserve"> به منظور شخصی سازی بیشتر در اجرای تست.</w:t>
+      </w:r>
+    </w:p>
+    <w:p>
+      <w:pPr>
+        <w:pStyle w:val="ListParagraph"/>
+        <w:numPr>
+          <w:ilvl w:val="2"/>
+          <w:numId w:val="1"/>
+        </w:numPr>
+        <w:bidi/>
+        <w:jc w:val="both"/>
+        <w:rPr>
+          <w:rFonts w:cs="B Zar"/>
+          <w:sz w:val="24"/>
+          <w:szCs w:val="24"/>
+          <w:lang w:bidi="fa-IR"/>
+        </w:rPr>
+      </w:pPr>
+      <w:r>
+        <w:rPr>
+          <w:rFonts w:cs="B Zar" w:hint="cs"/>
+          <w:sz w:val="24"/>
+          <w:szCs w:val="24"/>
+          <w:rtl/>
+          <w:lang w:bidi="fa-IR"/>
+        </w:rPr>
+        <w:t>تغییر فرمت خروجی تمام فایل ها به فرمت زیر:</w:t>
+      </w:r>
+    </w:p>
+    <w:p>
+      <w:pPr>
+        <w:ind w:left="90"/>
+        <w:rPr>
+          <w:rFonts w:cs="B Zar" w:hint="cs"/>
+          <w:rtl/>
+          <w:lang w:bidi="fa-IR"/>
+        </w:rPr>
+      </w:pPr>
+      <w:r>
+        <w:rPr>
+          <w:rFonts w:cs="B Zar"/>
+          <w:sz w:val="24"/>
+          <w:szCs w:val="24"/>
+          <w:lang w:bidi="fa-IR"/>
+        </w:rPr>
+        <w:t>Res</w:t>
+      </w:r>
+      <w:proofErr w:type="gramStart"/>
+      <w:r>
+        <w:rPr>
+          <w:rFonts w:cs="B Zar"/>
+          <w:sz w:val="24"/>
+          <w:szCs w:val="24"/>
+          <w:lang w:bidi="fa-IR"/>
+        </w:rPr>
+        <w:t xml:space="preserve">_{ </w:t>
+      </w:r>
+      <w:proofErr w:type="spellStart"/>
+      <w:r>
+        <w:rPr>
+          <w:rFonts w:cs="B Zar"/>
+          <w:sz w:val="24"/>
+          <w:szCs w:val="24"/>
+          <w:lang w:bidi="fa-IR"/>
+        </w:rPr>
+        <w:t>file</w:t>
+      </w:r>
+      <w:proofErr w:type="gramEnd"/>
+      <w:r>
+        <w:rPr>
+          <w:rFonts w:cs="B Zar"/>
+          <w:sz w:val="24"/>
+          <w:szCs w:val="24"/>
+          <w:lang w:bidi="fa-IR"/>
+        </w:rPr>
+        <w:t>_name</w:t>
+      </w:r>
+      <w:proofErr w:type="spellEnd"/>
+      <w:r>
+        <w:rPr>
+          <w:rFonts w:cs="B Zar"/>
+          <w:sz w:val="24"/>
+          <w:szCs w:val="24"/>
+          <w:lang w:bidi="fa-IR"/>
+        </w:rPr>
+        <w:t xml:space="preserve"> }</w:t>
+      </w:r>
+      <w:r>
+        <w:rPr>
+          <w:rFonts w:cs="B Zar"/>
+        </w:rPr>
+        <w:t>_</w:t>
+      </w:r>
+      <w:proofErr w:type="spellStart"/>
+      <w:r>
+        <w:rPr>
+          <w:rFonts w:cs="B Zar"/>
+        </w:rPr>
+        <w:t>TimeOptimize</w:t>
+      </w:r>
+      <w:proofErr w:type="spellEnd"/>
+      <w:r>
+        <w:rPr>
+          <w:rFonts w:cs="B Zar"/>
+        </w:rPr>
+        <w:t xml:space="preserve">_{ Test or Train }_{ symbol }_{ </w:t>
+      </w:r>
+      <w:proofErr w:type="spellStart"/>
+      <w:r>
+        <w:rPr>
+          <w:rFonts w:cs="B Zar"/>
+        </w:rPr>
+        <w:t>TimeFrame</w:t>
+      </w:r>
+      <w:proofErr w:type="spellEnd"/>
+      <w:r>
+        <w:rPr>
+          <w:rFonts w:cs="B Zar"/>
+        </w:rPr>
+        <w:t xml:space="preserve"> }_</w:t>
+      </w:r>
+      <w:r>
+        <w:rPr>
+          <w:rFonts w:cs="B Zar"/>
+          <w:sz w:val="24"/>
+          <w:szCs w:val="24"/>
+          <w:lang w:bidi="fa-IR"/>
+        </w:rPr>
+        <w:t>{ Timestamp }.format</w:t>
+      </w:r>
     </w:p>
     <w:sectPr>
       <w:pgSz w:w="12240" w:h="15840"/>
@@ -6085,7 +6235,7 @@
   <w:style w:type="paragraph" w:default="1" w:styleId="Normal">
     <w:name w:val="Normal"/>
     <w:qFormat/>
-    <w:rsid w:val="00E86F7A"/>
+    <w:rsid w:val="006011A2"/>
   </w:style>
   <w:style w:type="paragraph" w:styleId="Heading1">
     <w:name w:val="heading 1"/>

</xml_diff>